<commit_message>
Cover Letter v2: 1 page, pain-point-to-solution structure, why Innovation Agency motivation
</commit_message>
<xml_diff>
--- a/Zamir_Jamalov_Cover_Letter_Innovation_Agency_EN.docx
+++ b/Zamir_Jamalov_Cover_Letter_Innovation_Agency_EN.docx
@@ -18,7 +18,7 @@
     </w:p>
     <w:p>
       <w:pPr>
-        <w:spacing w:after="320" w:before="0"/>
+        <w:spacing w:after="240" w:before="0"/>
         <w:jc w:val="left"/>
       </w:pPr>
       <w:r>
@@ -33,8 +33,8 @@
     </w:p>
     <w:p>
       <w:pPr>
-        <w:spacing w:after="360" w:before="0"/>
-        <w:jc w:val="right"/>
+        <w:spacing w:after="160" w:before="0"/>
+        <w:jc w:val="left"/>
       </w:pPr>
       <w:r>
         <w:rPr>
@@ -42,12 +42,12 @@
           <w:b w:val="0"/>
           <w:sz w:val="22"/>
         </w:rPr>
-        <w:t>May 6, 2026</w:t>
+        <w:t>Baku, May 6, 2026</w:t>
       </w:r>
     </w:p>
     <w:p>
       <w:pPr>
-        <w:spacing w:after="40" w:before="0"/>
+        <w:spacing w:after="20" w:before="0"/>
         <w:jc w:val="left"/>
       </w:pPr>
       <w:r>
@@ -61,7 +61,7 @@
     </w:p>
     <w:p>
       <w:pPr>
-        <w:spacing w:after="280" w:before="0"/>
+        <w:spacing w:after="160" w:before="0"/>
         <w:jc w:val="left"/>
       </w:pPr>
       <w:r>
@@ -75,7 +75,7 @@
     </w:p>
     <w:p>
       <w:pPr>
-        <w:spacing w:after="280" w:before="0"/>
+        <w:spacing w:after="160" w:before="0"/>
         <w:jc w:val="left"/>
       </w:pPr>
       <w:r>
@@ -84,12 +84,12 @@
           <w:b/>
           <w:sz w:val="22"/>
         </w:rPr>
-        <w:t>Subject: Application for Senior Business Analyst / Lead Specialist - Design and Improvement of Public Services</w:t>
+        <w:t>Re: Application for Senior Business Analyst / Lead Specialist - Design and Improvement of Public Services</w:t>
       </w:r>
     </w:p>
     <w:p>
       <w:pPr>
-        <w:spacing w:after="200" w:before="0"/>
+        <w:spacing w:after="120" w:before="0"/>
         <w:jc w:val="left"/>
       </w:pPr>
       <w:r>
@@ -112,7 +112,7 @@
           <w:b w:val="0"/>
           <w:sz w:val="22"/>
         </w:rPr>
-        <w:t>I am writing to express my interest in the Senior Business Analyst / Lead Specialist position at the Innovation and Digital Development Agency. With 18 years in IT, including direct experience in government service digitization, multi-agency coordination and business analysis, I believe my background is well suited for the Agency's mission to improve public services through digital transformation.</w:t>
+        <w:t>I am applying for the Senior Business Analyst position because the Agency's mission to redesign and digitize government services directly matches my professional background. Over 18 years in IT, I have worked on both sides of government digital transformation: as a technical integrator connecting government systems, and as a business analyst designing end-to-end citizen services.</w:t>
       </w:r>
     </w:p>
     <w:p>
@@ -126,7 +126,7 @@
           <w:b w:val="0"/>
           <w:sz w:val="22"/>
         </w:rPr>
-        <w:t>My career has been built around a consistent theme: connecting government institutions with technology. At the Central Bank of Azerbaijan, I coordinated the integration of 10+ government organizations into the Government Payment Portal (GPP). This required defining data exchange requirements for each agency, building cross-system middleware, and working closely with multiple stakeholders to ensure seamless payment processing at national scale. This experience gave me a deep understanding of how government systems interact and where integration challenges arise.</w:t>
+        <w:t>I understand that the Agency's biggest challenge is coordinating across multiple government institutions: each agency has its own processes, systems and stakeholders, and making them work together for a single citizen service is complex. I have solved this exact problem. At the Central Bank, I coordinated the integration of 10+ government organizations into the Government Payment Portal, defining data exchange requirements and building cross-system middleware. At the State Employment Agency, I led the digitization of the Labour and Employment Subsystem (LMAS) with a 15-member cross-functional team, where I had to align stakeholders from different departments around a unified service architecture.</w:t>
       </w:r>
     </w:p>
     <w:p>
@@ -140,7 +140,7 @@
           <w:b w:val="0"/>
           <w:sz w:val="22"/>
         </w:rPr>
-        <w:t>At the State Employment Agency, I led the Innovation Department and served as Business Analyst for the Labour and Employment Subsystem (LMAS). I worked with a 15-member project team to digitize the employment service process. Specifically, I analyzed the full citizen service journey from application to result, identified pain points in the existing process, and designed the end-to-end architecture for the new system. Beyond traditional BA work, I designed a Telegram-based citizen service channel that enabled real-time application submission, directly improving service accessibility for citizens who could not visit the office in person. I also built a real-time monitoring dashboard for the management board, which provided transparent tracking of citizen applications, response times and service quality indicators.</w:t>
+        <w:t>I also understand that designing services is not only about technology but about putting citizens at the center. At the State Employment Agency, I analyzed the full citizen journey from application to result, identified bottlenecks, and designed a Telegram-based channel that allowed citizens to submit applications without visiting an office. I also built a monitoring dashboard for management to track application status, response times and service quality indicators in real time. These experiences gave me practical understanding of service journey analysis, SLA monitoring and citizen-centered design that the Agency applies in its work.</w:t>
       </w:r>
     </w:p>
     <w:p>
@@ -154,12 +154,12 @@
           <w:b w:val="0"/>
           <w:sz w:val="22"/>
         </w:rPr>
-        <w:t>In my current role at Embafinans, I lead business analysis for fintech products. I author BRD, FRD and SRS documents, write User Stories with Gherkin Acceptance Criteria, and define REST API specifications. I have hands-on experience with As-Is / To-Be process analysis, BPMN modeling, and backlog prioritization using the RICE framework. These methodologies are directly applicable to the Agency's work of analyzing and redesigning public services.</w:t>
+        <w:t>What brings me to the Agency is not just a job opportunity. I have experienced firsthand how government services can change when they are designed around citizens rather than institutions. Both the GPP and LMAS projects showed me the impact that well-designed digital services have on people's daily lives. The Innovation and Digital Development Agency is the driving force behind this transformation in Azerbaijan, and I want to contribute to that mission with my experience in multi-agency coordination, requirements documentation and government process design.</w:t>
       </w:r>
     </w:p>
     <w:p>
       <w:pPr>
-        <w:spacing w:after="160" w:before="0"/>
+        <w:spacing w:after="200" w:before="0"/>
         <w:jc w:val="left"/>
       </w:pPr>
       <w:r>
@@ -168,26 +168,12 @@
           <w:b w:val="0"/>
           <w:sz w:val="22"/>
         </w:rPr>
-        <w:t>What attracts me most to this position is the Agency's focus on end-to-end process architecture, multi-agency coordination and citizen-centered service design. These are not abstract concepts for me. I have applied them through the GPP multi-agency integration, the LMAS employment service digitization, and the citizen-facing Telegram channel. I understand how government institutions operate, how to engage stakeholders across different agencies, and how to design services that put citizens at the center.</w:t>
+        <w:t>I would welcome the opportunity to discuss how my background can support the Agency's goals in an interview.</w:t>
       </w:r>
     </w:p>
     <w:p>
       <w:pPr>
-        <w:spacing w:after="160" w:before="0"/>
-        <w:jc w:val="left"/>
-      </w:pPr>
-      <w:r>
-        <w:rPr>
-          <w:rFonts w:ascii="Calibri" w:hAnsi="Calibri"/>
-          <w:b w:val="0"/>
-          <w:sz w:val="22"/>
-        </w:rPr>
-        <w:t>I am confident that my combination of business analysis methodology, government sector experience and technical background would allow me to contribute meaningfully to the Agency's digital transformation initiatives from day one. I would welcome the opportunity to discuss how my experience can support the Agency's goals.</w:t>
-      </w:r>
-    </w:p>
-    <w:p>
-      <w:pPr>
-        <w:spacing w:after="80" w:before="280"/>
+        <w:spacing w:after="40" w:before="120"/>
         <w:jc w:val="left"/>
       </w:pPr>
       <w:r>
@@ -208,14 +194,14 @@
         <w:rPr>
           <w:rFonts w:ascii="Calibri" w:hAnsi="Calibri"/>
           <w:b/>
-          <w:sz w:val="24"/>
+          <w:sz w:val="22"/>
         </w:rPr>
         <w:t>Zamir Jamalov</w:t>
       </w:r>
     </w:p>
     <w:sectPr>
       <w:pgSz w:w="12240" w:h="15840"/>
-      <w:pgMar w:top="1152" w:right="1440" w:bottom="1152" w:left="1440" w:header="720" w:footer="720" w:gutter="0"/>
+      <w:pgMar w:top="1152" w:right="1440" w:bottom="864" w:left="1440" w:header="720" w:footer="720" w:gutter="0"/>
       <w:cols w:space="720"/>
       <w:docGrid w:linePitch="360"/>
     </w:sectPr>

</xml_diff>